<commit_message>
add scan qr code and scan barcode barang
</commit_message>
<xml_diff>
--- a/output/doc/Deployment-Guide.docx
+++ b/output/doc/Deployment-Guide.docx
@@ -54,16 +54,12 @@
         <w:rPr>
           <w:rFonts w:ascii="Times New Roman" w:hAnsi="Times New Roman" w:cs="Times New Roman"/>
           <w:color w:val="000000" w:themeColor="text1"/>
-          <w:sz w:val="24"/>
-          <w:szCs w:val="24"/>
         </w:rPr>
       </w:pPr>
       <w:r>
         <w:rPr>
           <w:rFonts w:ascii="Times New Roman" w:hAnsi="Times New Roman" w:cs="Times New Roman"/>
           <w:color w:val="000000" w:themeColor="text1"/>
-          <w:sz w:val="24"/>
-          <w:szCs w:val="24"/>
         </w:rPr>
         <w:t>Saran link</w:t>
       </w:r>
@@ -78,8 +74,6 @@
         <w:rPr>
           <w:rFonts w:ascii="Times New Roman" w:hAnsi="Times New Roman" w:cs="Times New Roman"/>
           <w:color w:val="000000" w:themeColor="text1"/>
-          <w:sz w:val="24"/>
-          <w:szCs w:val="24"/>
         </w:rPr>
       </w:pPr>
       <w:proofErr w:type="spellStart"/>
@@ -87,8 +81,6 @@
         <w:rPr>
           <w:rFonts w:ascii="Times New Roman" w:hAnsi="Times New Roman" w:cs="Times New Roman"/>
           <w:color w:val="000000" w:themeColor="text1"/>
-          <w:sz w:val="24"/>
-          <w:szCs w:val="24"/>
         </w:rPr>
         <w:t>taksiran-harga</w:t>
       </w:r>
@@ -105,8 +97,6 @@
         <w:rPr>
           <w:rFonts w:ascii="Times New Roman" w:hAnsi="Times New Roman" w:cs="Times New Roman"/>
           <w:color w:val="000000" w:themeColor="text1"/>
-          <w:sz w:val="24"/>
-          <w:szCs w:val="24"/>
         </w:rPr>
       </w:pPr>
     </w:p>
@@ -121,16 +111,16 @@
         <w:rPr>
           <w:rFonts w:ascii="Times New Roman" w:hAnsi="Times New Roman" w:cs="Times New Roman"/>
           <w:color w:val="000000" w:themeColor="text1"/>
-          <w:sz w:val="24"/>
-          <w:szCs w:val="24"/>
+          <w:sz w:val="22"/>
+          <w:szCs w:val="22"/>
         </w:rPr>
       </w:pPr>
       <w:r>
         <w:rPr>
           <w:rFonts w:ascii="Times New Roman" w:hAnsi="Times New Roman" w:cs="Times New Roman"/>
           <w:color w:val="000000" w:themeColor="text1"/>
-          <w:sz w:val="24"/>
-          <w:szCs w:val="24"/>
+          <w:sz w:val="22"/>
+          <w:szCs w:val="22"/>
         </w:rPr>
         <w:t xml:space="preserve">Ambil Kode </w:t>
       </w:r>
@@ -139,8 +129,8 @@
         <w:rPr>
           <w:rFonts w:ascii="Times New Roman" w:hAnsi="Times New Roman" w:cs="Times New Roman"/>
           <w:color w:val="000000" w:themeColor="text1"/>
-          <w:sz w:val="24"/>
-          <w:szCs w:val="24"/>
+          <w:sz w:val="22"/>
+          <w:szCs w:val="22"/>
         </w:rPr>
         <w:t>dari</w:t>
       </w:r>
@@ -149,8 +139,8 @@
         <w:rPr>
           <w:rFonts w:ascii="Times New Roman" w:hAnsi="Times New Roman" w:cs="Times New Roman"/>
           <w:color w:val="000000" w:themeColor="text1"/>
-          <w:sz w:val="24"/>
-          <w:szCs w:val="24"/>
+          <w:sz w:val="22"/>
+          <w:szCs w:val="22"/>
         </w:rPr>
         <w:t xml:space="preserve"> Repo</w:t>
       </w:r>
@@ -165,16 +155,12 @@
         <w:rPr>
           <w:rFonts w:ascii="Times New Roman" w:hAnsi="Times New Roman" w:cs="Times New Roman"/>
           <w:color w:val="000000" w:themeColor="text1"/>
-          <w:sz w:val="24"/>
-          <w:szCs w:val="24"/>
         </w:rPr>
       </w:pPr>
       <w:r>
         <w:rPr>
           <w:rFonts w:ascii="Times New Roman" w:eastAsia="Courier New" w:hAnsi="Times New Roman" w:cs="Times New Roman"/>
           <w:color w:val="000000" w:themeColor="text1"/>
-          <w:sz w:val="24"/>
-          <w:szCs w:val="24"/>
         </w:rPr>
         <w:t>REPO_URL</w:t>
       </w:r>
@@ -182,8 +168,6 @@
         <w:rPr>
           <w:rFonts w:ascii="Times New Roman" w:eastAsia="Courier New" w:hAnsi="Times New Roman" w:cs="Times New Roman"/>
           <w:color w:val="000000" w:themeColor="text1"/>
-          <w:sz w:val="24"/>
-          <w:szCs w:val="24"/>
         </w:rPr>
         <w:t xml:space="preserve">= </w:t>
       </w:r>
@@ -191,8 +175,6 @@
         <w:rPr>
           <w:rFonts w:ascii="Times New Roman" w:eastAsia="Courier New" w:hAnsi="Times New Roman" w:cs="Times New Roman"/>
           <w:color w:val="000000" w:themeColor="text1"/>
-          <w:sz w:val="24"/>
-          <w:szCs w:val="24"/>
         </w:rPr>
         <w:t>https://github.com/diyantiaan08/taksiran-harga-jual.git</w:t>
       </w:r>
@@ -203,16 +185,12 @@
         <w:rPr>
           <w:rFonts w:ascii="Times New Roman" w:hAnsi="Times New Roman" w:cs="Times New Roman"/>
           <w:color w:val="000000" w:themeColor="text1"/>
-          <w:sz w:val="24"/>
-          <w:szCs w:val="24"/>
         </w:rPr>
       </w:pPr>
       <w:r>
         <w:rPr>
           <w:rFonts w:ascii="Times New Roman" w:eastAsia="Courier New" w:hAnsi="Times New Roman" w:cs="Times New Roman"/>
           <w:color w:val="000000" w:themeColor="text1"/>
-          <w:sz w:val="24"/>
-          <w:szCs w:val="24"/>
         </w:rPr>
         <w:t>git clone $REPO_URL</w:t>
       </w:r>
@@ -223,16 +201,12 @@
         <w:rPr>
           <w:rFonts w:ascii="Times New Roman" w:hAnsi="Times New Roman" w:cs="Times New Roman"/>
           <w:color w:val="000000" w:themeColor="text1"/>
-          <w:sz w:val="24"/>
-          <w:szCs w:val="24"/>
         </w:rPr>
       </w:pPr>
       <w:r>
         <w:rPr>
           <w:rFonts w:ascii="Times New Roman" w:hAnsi="Times New Roman" w:cs="Times New Roman"/>
           <w:color w:val="000000" w:themeColor="text1"/>
-          <w:sz w:val="24"/>
-          <w:szCs w:val="24"/>
         </w:rPr>
         <w:t>Struktur repo:</w:t>
       </w:r>
@@ -248,16 +222,12 @@
         <w:rPr>
           <w:rFonts w:ascii="Times New Roman" w:hAnsi="Times New Roman" w:cs="Times New Roman"/>
           <w:color w:val="000000" w:themeColor="text1"/>
-          <w:sz w:val="24"/>
-          <w:szCs w:val="24"/>
         </w:rPr>
       </w:pPr>
       <w:r>
         <w:rPr>
           <w:rFonts w:ascii="Times New Roman" w:hAnsi="Times New Roman" w:cs="Times New Roman"/>
           <w:color w:val="000000" w:themeColor="text1"/>
-          <w:sz w:val="24"/>
-          <w:szCs w:val="24"/>
         </w:rPr>
         <w:t>FE: taksiran-harga/</w:t>
       </w:r>
@@ -273,16 +243,12 @@
         <w:rPr>
           <w:rFonts w:ascii="Times New Roman" w:hAnsi="Times New Roman" w:cs="Times New Roman"/>
           <w:color w:val="000000" w:themeColor="text1"/>
-          <w:sz w:val="24"/>
-          <w:szCs w:val="24"/>
         </w:rPr>
       </w:pPr>
       <w:r>
         <w:rPr>
           <w:rFonts w:ascii="Times New Roman" w:hAnsi="Times New Roman" w:cs="Times New Roman"/>
           <w:color w:val="000000" w:themeColor="text1"/>
-          <w:sz w:val="24"/>
-          <w:szCs w:val="24"/>
         </w:rPr>
         <w:t xml:space="preserve">BE: </w:t>
       </w:r>
@@ -291,8 +257,6 @@
         <w:rPr>
           <w:rFonts w:ascii="Times New Roman" w:hAnsi="Times New Roman" w:cs="Times New Roman"/>
           <w:color w:val="000000" w:themeColor="text1"/>
-          <w:sz w:val="24"/>
-          <w:szCs w:val="24"/>
         </w:rPr>
         <w:t>taksiran</w:t>
       </w:r>
@@ -301,8 +265,6 @@
         <w:rPr>
           <w:rFonts w:ascii="Times New Roman" w:hAnsi="Times New Roman" w:cs="Times New Roman"/>
           <w:color w:val="000000" w:themeColor="text1"/>
-          <w:sz w:val="24"/>
-          <w:szCs w:val="24"/>
         </w:rPr>
         <w:t>-be/</w:t>
       </w:r>
@@ -318,8 +280,6 @@
         <w:rPr>
           <w:rFonts w:ascii="Times New Roman" w:hAnsi="Times New Roman" w:cs="Times New Roman"/>
           <w:color w:val="000000" w:themeColor="text1"/>
-          <w:sz w:val="24"/>
-          <w:szCs w:val="24"/>
         </w:rPr>
       </w:pPr>
     </w:p>
@@ -334,16 +294,16 @@
         <w:rPr>
           <w:rFonts w:ascii="Times New Roman" w:hAnsi="Times New Roman" w:cs="Times New Roman"/>
           <w:color w:val="000000" w:themeColor="text1"/>
-          <w:sz w:val="24"/>
-          <w:szCs w:val="24"/>
+          <w:sz w:val="22"/>
+          <w:szCs w:val="22"/>
         </w:rPr>
       </w:pPr>
       <w:r>
         <w:rPr>
           <w:rFonts w:ascii="Times New Roman" w:hAnsi="Times New Roman" w:cs="Times New Roman"/>
           <w:color w:val="000000" w:themeColor="text1"/>
-          <w:sz w:val="24"/>
-          <w:szCs w:val="24"/>
+          <w:sz w:val="22"/>
+          <w:szCs w:val="22"/>
         </w:rPr>
         <w:t>Setup Backend (Node/Express)</w:t>
       </w:r>
@@ -354,16 +314,12 @@
         <w:rPr>
           <w:rFonts w:ascii="Times New Roman" w:hAnsi="Times New Roman" w:cs="Times New Roman"/>
           <w:color w:val="000000" w:themeColor="text1"/>
-          <w:sz w:val="24"/>
-          <w:szCs w:val="24"/>
         </w:rPr>
       </w:pPr>
       <w:r>
         <w:rPr>
           <w:rFonts w:ascii="Times New Roman" w:eastAsia="Courier New" w:hAnsi="Times New Roman" w:cs="Times New Roman"/>
           <w:color w:val="000000" w:themeColor="text1"/>
-          <w:sz w:val="24"/>
-          <w:szCs w:val="24"/>
         </w:rPr>
         <w:t>cd /home/nodeapp</w:t>
       </w:r>
@@ -371,8 +327,6 @@
         <w:rPr>
           <w:rFonts w:ascii="Times New Roman" w:eastAsia="Courier New" w:hAnsi="Times New Roman" w:cs="Times New Roman"/>
           <w:color w:val="000000" w:themeColor="text1"/>
-          <w:sz w:val="24"/>
-          <w:szCs w:val="24"/>
         </w:rPr>
         <w:br/>
         <w:t>rm -rf /home/nodeapp/*</w:t>
@@ -381,8 +335,6 @@
         <w:rPr>
           <w:rFonts w:ascii="Times New Roman" w:eastAsia="Courier New" w:hAnsi="Times New Roman" w:cs="Times New Roman"/>
           <w:color w:val="000000" w:themeColor="text1"/>
-          <w:sz w:val="24"/>
-          <w:szCs w:val="24"/>
         </w:rPr>
         <w:br/>
         <w:t>cp -r /path/to/repo/taksiran-be/* /home/nodeapp/</w:t>
@@ -396,8 +348,6 @@
           <w:b/>
           <w:bCs/>
           <w:color w:val="000000" w:themeColor="text1"/>
-          <w:sz w:val="24"/>
-          <w:szCs w:val="24"/>
         </w:rPr>
       </w:pPr>
       <w:r>
@@ -406,10 +356,46 @@
           <w:b/>
           <w:bCs/>
           <w:color w:val="000000" w:themeColor="text1"/>
-          <w:sz w:val="24"/>
-          <w:szCs w:val="24"/>
         </w:rPr>
         <w:t>Env BE:</w:t>
+      </w:r>
+    </w:p>
+    <w:p>
+      <w:pPr>
+        <w:autoSpaceDE w:val="0"/>
+        <w:autoSpaceDN w:val="0"/>
+        <w:adjustRightInd w:val="0"/>
+        <w:spacing w:after="0" w:line="240" w:lineRule="auto"/>
+        <w:ind w:left="360"/>
+        <w:rPr>
+          <w:rFonts w:ascii="AppleSystemUIFont" w:hAnsi="AppleSystemUIFont" w:cs="AppleSystemUIFont"/>
+        </w:rPr>
+      </w:pPr>
+      <w:r>
+        <w:rPr>
+          <w:rFonts w:ascii="Times New Roman" w:eastAsia="Courier New" w:hAnsi="Times New Roman" w:cs="Times New Roman"/>
+          <w:color w:val="000000" w:themeColor="text1"/>
+        </w:rPr>
+        <w:t>MONGODB_URI=</w:t>
+      </w:r>
+      <w:r>
+        <w:rPr>
+          <w:rFonts w:ascii="System Font" w:hAnsi="System Font" w:cs="System Font"/>
+        </w:rPr>
+        <w:t>"</w:t>
+      </w:r>
+      <w:r>
+        <w:rPr>
+          <w:rFonts w:ascii="Times New Roman" w:eastAsia="Courier New" w:hAnsi="Times New Roman" w:cs="Times New Roman"/>
+          <w:color w:val="000000" w:themeColor="text1"/>
+        </w:rPr>
+        <w:t>CFA2E09BE2D4D7AE6097A1E59DADB3C5BE82D09CCC6CEBA8E0A9719963A06CA1A0A3A56B9A6AA265AA9FD9D690DC94DDA7DCE2D6E290D2A8D3A0B2D1EAE899BBA2E7A6D6D5B2D595D59CE05AE5D5E5E09ACB94C599E7ADE7E7618EA5D7A8E5E9CCE69ADC98E571E7E2EAD957DF70DF95DDDFE7DDA5E159E499D4D4C5E696CE98E499E1D3DAB1A4CD96E1A2D7D1E7ED81DA98D899E5E2DAD857CC9CE499D6E4B8E39FD698D5A8DCDFE3B1A5DAA8D7</w:t>
+      </w:r>
+      <w:r>
+        <w:rPr>
+          <w:rFonts w:ascii="System Font" w:hAnsi="System Font" w:cs="System Font"/>
+        </w:rPr>
+        <w:t>"</w:t>
       </w:r>
     </w:p>
     <w:p>
@@ -418,34 +404,12 @@
         <w:rPr>
           <w:rFonts w:ascii="Times New Roman" w:hAnsi="Times New Roman" w:cs="Times New Roman"/>
           <w:color w:val="000000" w:themeColor="text1"/>
-          <w:sz w:val="24"/>
-          <w:szCs w:val="24"/>
         </w:rPr>
       </w:pPr>
       <w:r>
         <w:rPr>
           <w:rFonts w:ascii="Times New Roman" w:eastAsia="Courier New" w:hAnsi="Times New Roman" w:cs="Times New Roman"/>
           <w:color w:val="000000" w:themeColor="text1"/>
-          <w:sz w:val="24"/>
-          <w:szCs w:val="24"/>
-        </w:rPr>
-        <w:t>MONGODB_URI=</w:t>
-      </w:r>
-      <w:r>
-        <w:rPr>
-          <w:rFonts w:ascii="Times New Roman" w:eastAsia="Courier New" w:hAnsi="Times New Roman" w:cs="Times New Roman"/>
-          <w:color w:val="000000" w:themeColor="text1"/>
-          <w:sz w:val="24"/>
-          <w:szCs w:val="24"/>
-        </w:rPr>
-        <w:t>CFA2E09BE2D4D7AE6097A1E59DADB3C5BE82D09CCC6CEBA8E0A9719963A06CA1A0A3A56B9A6AA265AA9FD9D690DC94DDA7DCE2D6E290D2A8D3A0B2D1EAE899BBA2E7A6D6D5B2D595D59CE05AE5D5E5E09ACB94C599E7ADE7E7618EA5D7A8E5E9CCE69ADC98E571E7E2EAD957DF70DF95DDDFE7DDA5E159E499D4D4C5E696CE98E499E1D3DAB1A4CD96E1A2D7D1E7ED81DA98D899E5E2DAD857CC9CE499D6E4B8E39FD698D5A8DCDFE3B1A5DAA8D7</w:t>
-      </w:r>
-      <w:r>
-        <w:rPr>
-          <w:rFonts w:ascii="Times New Roman" w:eastAsia="Courier New" w:hAnsi="Times New Roman" w:cs="Times New Roman"/>
-          <w:color w:val="000000" w:themeColor="text1"/>
-          <w:sz w:val="24"/>
-          <w:szCs w:val="24"/>
         </w:rPr>
         <w:br/>
         <w:t>PORT=3000</w:t>
@@ -459,8 +423,6 @@
           <w:b/>
           <w:bCs/>
           <w:color w:val="000000" w:themeColor="text1"/>
-          <w:sz w:val="24"/>
-          <w:szCs w:val="24"/>
         </w:rPr>
       </w:pPr>
       <w:r>
@@ -469,8 +431,6 @@
           <w:b/>
           <w:bCs/>
           <w:color w:val="000000" w:themeColor="text1"/>
-          <w:sz w:val="24"/>
-          <w:szCs w:val="24"/>
         </w:rPr>
         <w:t>Install &amp; Run:</w:t>
       </w:r>
@@ -481,16 +441,12 @@
         <w:rPr>
           <w:rFonts w:ascii="Times New Roman" w:hAnsi="Times New Roman" w:cs="Times New Roman"/>
           <w:color w:val="000000" w:themeColor="text1"/>
-          <w:sz w:val="24"/>
-          <w:szCs w:val="24"/>
         </w:rPr>
       </w:pPr>
       <w:r>
         <w:rPr>
           <w:rFonts w:ascii="Times New Roman" w:eastAsia="Courier New" w:hAnsi="Times New Roman" w:cs="Times New Roman"/>
           <w:color w:val="000000" w:themeColor="text1"/>
-          <w:sz w:val="24"/>
-          <w:szCs w:val="24"/>
         </w:rPr>
         <w:t>cd /home/nodeapp</w:t>
       </w:r>
@@ -498,8 +454,6 @@
         <w:rPr>
           <w:rFonts w:ascii="Times New Roman" w:eastAsia="Courier New" w:hAnsi="Times New Roman" w:cs="Times New Roman"/>
           <w:color w:val="000000" w:themeColor="text1"/>
-          <w:sz w:val="24"/>
-          <w:szCs w:val="24"/>
         </w:rPr>
         <w:br/>
         <w:t>npm install</w:t>
@@ -508,8 +462,6 @@
         <w:rPr>
           <w:rFonts w:ascii="Times New Roman" w:eastAsia="Courier New" w:hAnsi="Times New Roman" w:cs="Times New Roman"/>
           <w:color w:val="000000" w:themeColor="text1"/>
-          <w:sz w:val="24"/>
-          <w:szCs w:val="24"/>
         </w:rPr>
         <w:br/>
         <w:t xml:space="preserve">node </w:t>
@@ -519,8 +471,6 @@
         <w:rPr>
           <w:rFonts w:ascii="Times New Roman" w:eastAsia="Courier New" w:hAnsi="Times New Roman" w:cs="Times New Roman"/>
           <w:color w:val="000000" w:themeColor="text1"/>
-          <w:sz w:val="24"/>
-          <w:szCs w:val="24"/>
         </w:rPr>
         <w:t>index.js</w:t>
       </w:r>
@@ -534,8 +484,6 @@
           <w:b/>
           <w:bCs/>
           <w:color w:val="000000" w:themeColor="text1"/>
-          <w:sz w:val="24"/>
-          <w:szCs w:val="24"/>
         </w:rPr>
       </w:pPr>
       <w:r>
@@ -544,8 +492,6 @@
           <w:b/>
           <w:bCs/>
           <w:color w:val="000000" w:themeColor="text1"/>
-          <w:sz w:val="24"/>
-          <w:szCs w:val="24"/>
         </w:rPr>
         <w:t>Opsional (PM2):</w:t>
       </w:r>
@@ -556,26 +502,19 @@
         <w:rPr>
           <w:rFonts w:ascii="Times New Roman" w:eastAsia="Courier New" w:hAnsi="Times New Roman" w:cs="Times New Roman"/>
           <w:color w:val="000000" w:themeColor="text1"/>
-          <w:sz w:val="24"/>
-          <w:szCs w:val="24"/>
         </w:rPr>
       </w:pPr>
       <w:r>
         <w:rPr>
           <w:rFonts w:ascii="Times New Roman" w:eastAsia="Courier New" w:hAnsi="Times New Roman" w:cs="Times New Roman"/>
           <w:color w:val="000000" w:themeColor="text1"/>
-          <w:sz w:val="24"/>
-          <w:szCs w:val="24"/>
         </w:rPr>
-        <w:lastRenderedPageBreak/>
         <w:t>npm install -g pm2</w:t>
       </w:r>
       <w:r>
         <w:rPr>
           <w:rFonts w:ascii="Times New Roman" w:eastAsia="Courier New" w:hAnsi="Times New Roman" w:cs="Times New Roman"/>
           <w:color w:val="000000" w:themeColor="text1"/>
-          <w:sz w:val="24"/>
-          <w:szCs w:val="24"/>
         </w:rPr>
         <w:br/>
         <w:t>pm2 start index.js --name taksiran-be</w:t>
@@ -584,8 +523,6 @@
         <w:rPr>
           <w:rFonts w:ascii="Times New Roman" w:eastAsia="Courier New" w:hAnsi="Times New Roman" w:cs="Times New Roman"/>
           <w:color w:val="000000" w:themeColor="text1"/>
-          <w:sz w:val="24"/>
-          <w:szCs w:val="24"/>
         </w:rPr>
         <w:br/>
         <w:t>pm2 save</w:t>
@@ -594,8 +531,6 @@
         <w:rPr>
           <w:rFonts w:ascii="Times New Roman" w:eastAsia="Courier New" w:hAnsi="Times New Roman" w:cs="Times New Roman"/>
           <w:color w:val="000000" w:themeColor="text1"/>
-          <w:sz w:val="24"/>
-          <w:szCs w:val="24"/>
         </w:rPr>
         <w:br/>
         <w:t xml:space="preserve">pm2 </w:t>
@@ -605,8 +540,6 @@
         <w:rPr>
           <w:rFonts w:ascii="Times New Roman" w:eastAsia="Courier New" w:hAnsi="Times New Roman" w:cs="Times New Roman"/>
           <w:color w:val="000000" w:themeColor="text1"/>
-          <w:sz w:val="24"/>
-          <w:szCs w:val="24"/>
         </w:rPr>
         <w:t>startup</w:t>
       </w:r>
@@ -618,8 +551,6 @@
         <w:rPr>
           <w:rFonts w:ascii="Times New Roman" w:hAnsi="Times New Roman" w:cs="Times New Roman"/>
           <w:color w:val="000000" w:themeColor="text1"/>
-          <w:sz w:val="24"/>
-          <w:szCs w:val="24"/>
         </w:rPr>
       </w:pPr>
     </w:p>
@@ -634,16 +565,16 @@
         <w:rPr>
           <w:rFonts w:ascii="Times New Roman" w:hAnsi="Times New Roman" w:cs="Times New Roman"/>
           <w:color w:val="000000" w:themeColor="text1"/>
-          <w:sz w:val="24"/>
-          <w:szCs w:val="24"/>
+          <w:sz w:val="22"/>
+          <w:szCs w:val="22"/>
         </w:rPr>
       </w:pPr>
       <w:r>
         <w:rPr>
           <w:rFonts w:ascii="Times New Roman" w:hAnsi="Times New Roman" w:cs="Times New Roman"/>
           <w:color w:val="000000" w:themeColor="text1"/>
-          <w:sz w:val="24"/>
-          <w:szCs w:val="24"/>
+          <w:sz w:val="22"/>
+          <w:szCs w:val="22"/>
         </w:rPr>
         <w:t>Setup Frontend (</w:t>
       </w:r>
@@ -652,8 +583,8 @@
         <w:rPr>
           <w:rFonts w:ascii="Times New Roman" w:hAnsi="Times New Roman" w:cs="Times New Roman"/>
           <w:color w:val="000000" w:themeColor="text1"/>
-          <w:sz w:val="24"/>
-          <w:szCs w:val="24"/>
+          <w:sz w:val="22"/>
+          <w:szCs w:val="22"/>
         </w:rPr>
         <w:t>Vite</w:t>
       </w:r>
@@ -662,8 +593,8 @@
         <w:rPr>
           <w:rFonts w:ascii="Times New Roman" w:hAnsi="Times New Roman" w:cs="Times New Roman"/>
           <w:color w:val="000000" w:themeColor="text1"/>
-          <w:sz w:val="24"/>
-          <w:szCs w:val="24"/>
+          <w:sz w:val="22"/>
+          <w:szCs w:val="22"/>
         </w:rPr>
         <w:t xml:space="preserve"> React)</w:t>
       </w:r>
@@ -674,16 +605,12 @@
         <w:rPr>
           <w:rFonts w:ascii="Times New Roman" w:hAnsi="Times New Roman" w:cs="Times New Roman"/>
           <w:color w:val="000000" w:themeColor="text1"/>
-          <w:sz w:val="24"/>
-          <w:szCs w:val="24"/>
         </w:rPr>
       </w:pPr>
       <w:r>
         <w:rPr>
           <w:rFonts w:ascii="Times New Roman" w:eastAsia="Courier New" w:hAnsi="Times New Roman" w:cs="Times New Roman"/>
           <w:color w:val="000000" w:themeColor="text1"/>
-          <w:sz w:val="24"/>
-          <w:szCs w:val="24"/>
         </w:rPr>
         <w:t>cd /path/to/repo/</w:t>
       </w:r>
@@ -692,8 +619,6 @@
         <w:rPr>
           <w:rFonts w:ascii="Times New Roman" w:eastAsia="Courier New" w:hAnsi="Times New Roman" w:cs="Times New Roman"/>
           <w:color w:val="000000" w:themeColor="text1"/>
-          <w:sz w:val="24"/>
-          <w:szCs w:val="24"/>
         </w:rPr>
         <w:t>taksiran-harga</w:t>
       </w:r>
@@ -707,8 +632,6 @@
           <w:b/>
           <w:bCs/>
           <w:color w:val="000000" w:themeColor="text1"/>
-          <w:sz w:val="24"/>
-          <w:szCs w:val="24"/>
         </w:rPr>
       </w:pPr>
       <w:r>
@@ -717,8 +640,6 @@
           <w:b/>
           <w:bCs/>
           <w:color w:val="000000" w:themeColor="text1"/>
-          <w:sz w:val="24"/>
-          <w:szCs w:val="24"/>
         </w:rPr>
         <w:t>Env FE (tanpa proxy):</w:t>
       </w:r>
@@ -729,16 +650,12 @@
         <w:rPr>
           <w:rFonts w:ascii="Times New Roman" w:hAnsi="Times New Roman" w:cs="Times New Roman"/>
           <w:color w:val="000000" w:themeColor="text1"/>
-          <w:sz w:val="24"/>
-          <w:szCs w:val="24"/>
         </w:rPr>
       </w:pPr>
       <w:r>
         <w:rPr>
           <w:rFonts w:ascii="Times New Roman" w:eastAsia="Courier New" w:hAnsi="Times New Roman" w:cs="Times New Roman"/>
           <w:color w:val="000000" w:themeColor="text1"/>
-          <w:sz w:val="24"/>
-          <w:szCs w:val="24"/>
         </w:rPr>
         <w:t>VITE_API_URL=http://IP_OR_DOMAIN_BE:3000</w:t>
       </w:r>
@@ -751,8 +668,6 @@
           <w:b/>
           <w:bCs/>
           <w:color w:val="000000" w:themeColor="text1"/>
-          <w:sz w:val="24"/>
-          <w:szCs w:val="24"/>
         </w:rPr>
       </w:pPr>
       <w:r>
@@ -761,8 +676,6 @@
           <w:b/>
           <w:bCs/>
           <w:color w:val="000000" w:themeColor="text1"/>
-          <w:sz w:val="24"/>
-          <w:szCs w:val="24"/>
         </w:rPr>
         <w:t>Env FE (pakai proxy /api):</w:t>
       </w:r>
@@ -773,16 +686,12 @@
         <w:rPr>
           <w:rFonts w:ascii="Times New Roman" w:hAnsi="Times New Roman" w:cs="Times New Roman"/>
           <w:color w:val="000000" w:themeColor="text1"/>
-          <w:sz w:val="24"/>
-          <w:szCs w:val="24"/>
         </w:rPr>
       </w:pPr>
       <w:r>
         <w:rPr>
           <w:rFonts w:ascii="Times New Roman" w:eastAsia="Courier New" w:hAnsi="Times New Roman" w:cs="Times New Roman"/>
           <w:color w:val="000000" w:themeColor="text1"/>
-          <w:sz w:val="24"/>
-          <w:szCs w:val="24"/>
         </w:rPr>
         <w:t>VITE_API_URL=/api</w:t>
       </w:r>
@@ -795,8 +704,6 @@
           <w:b/>
           <w:bCs/>
           <w:color w:val="000000" w:themeColor="text1"/>
-          <w:sz w:val="24"/>
-          <w:szCs w:val="24"/>
         </w:rPr>
       </w:pPr>
       <w:r>
@@ -805,8 +712,6 @@
           <w:b/>
           <w:bCs/>
           <w:color w:val="000000" w:themeColor="text1"/>
-          <w:sz w:val="24"/>
-          <w:szCs w:val="24"/>
         </w:rPr>
         <w:t>Build &amp; Deploy FE:</w:t>
       </w:r>
@@ -817,16 +722,12 @@
         <w:rPr>
           <w:rFonts w:ascii="Times New Roman" w:hAnsi="Times New Roman" w:cs="Times New Roman"/>
           <w:color w:val="000000" w:themeColor="text1"/>
-          <w:sz w:val="24"/>
-          <w:szCs w:val="24"/>
         </w:rPr>
       </w:pPr>
       <w:r>
         <w:rPr>
           <w:rFonts w:ascii="Times New Roman" w:eastAsia="Courier New" w:hAnsi="Times New Roman" w:cs="Times New Roman"/>
           <w:color w:val="000000" w:themeColor="text1"/>
-          <w:sz w:val="24"/>
-          <w:szCs w:val="24"/>
         </w:rPr>
         <w:t>npm install</w:t>
       </w:r>
@@ -834,8 +735,6 @@
         <w:rPr>
           <w:rFonts w:ascii="Times New Roman" w:eastAsia="Courier New" w:hAnsi="Times New Roman" w:cs="Times New Roman"/>
           <w:color w:val="000000" w:themeColor="text1"/>
-          <w:sz w:val="24"/>
-          <w:szCs w:val="24"/>
         </w:rPr>
         <w:br/>
         <w:t>npm run build</w:t>
@@ -844,8 +743,6 @@
         <w:rPr>
           <w:rFonts w:ascii="Times New Roman" w:eastAsia="Courier New" w:hAnsi="Times New Roman" w:cs="Times New Roman"/>
           <w:color w:val="000000" w:themeColor="text1"/>
-          <w:sz w:val="24"/>
-          <w:szCs w:val="24"/>
         </w:rPr>
         <w:br/>
         <w:t>rm -rf /var/www/html/*</w:t>
@@ -854,8 +751,6 @@
         <w:rPr>
           <w:rFonts w:ascii="Times New Roman" w:eastAsia="Courier New" w:hAnsi="Times New Roman" w:cs="Times New Roman"/>
           <w:color w:val="000000" w:themeColor="text1"/>
-          <w:sz w:val="24"/>
-          <w:szCs w:val="24"/>
         </w:rPr>
         <w:br/>
         <w:t>cp -r dist/* /var/www/html/</w:t>

</xml_diff>